<commit_message>
docs: Update user manual.
</commit_message>
<xml_diff>
--- a/public/docs/manual-usuario/MANUAL_USUARIO_ANCLORA_NEXUS.docx
+++ b/public/docs/manual-usuario/MANUAL_USUARIO_ANCLORA_NEXUS.docx
@@ -123,7 +123,7 @@
         </w:rPr>
         <w:t>Versión 1.2.3</w:t>
         <w:br/>
-        <w:t>10/03/2026</w:t>
+        <w:t>11/03/2026</w:t>
       </w:r>
     </w:p>
     <w:p>
@@ -940,6 +940,56 @@
         <w:t>3.1 Dashboard</w:t>
       </w:r>
     </w:p>
+    <w:p>
+      <w:r>
+        <w:drawing>
+          <wp:inline xmlns:a="http://schemas.openxmlformats.org/drawingml/2006/main" xmlns:pic="http://schemas.openxmlformats.org/drawingml/2006/picture">
+            <wp:extent cx="5486400" cy="3086100"/>
+            <wp:docPr id="2" name="Picture 2"/>
+            <wp:cNvGraphicFramePr>
+              <a:graphicFrameLocks noChangeAspect="1"/>
+            </wp:cNvGraphicFramePr>
+            <a:graphic>
+              <a:graphicData uri="http://schemas.openxmlformats.org/drawingml/2006/picture">
+                <pic:pic>
+                  <pic:nvPicPr>
+                    <pic:cNvPr id="0" name="01-dashboard.png"/>
+                    <pic:cNvPicPr/>
+                  </pic:nvPicPr>
+                  <pic:blipFill>
+                    <a:blip r:embed="rId10"/>
+                    <a:stretch>
+                      <a:fillRect/>
+                    </a:stretch>
+                  </pic:blipFill>
+                  <pic:spPr>
+                    <a:xfrm>
+                      <a:off x="0" y="0"/>
+                      <a:ext cx="5486400" cy="3086100"/>
+                    </a:xfrm>
+                    <a:prstGeom prst="rect"/>
+                  </pic:spPr>
+                </pic:pic>
+              </a:graphicData>
+            </a:graphic>
+          </wp:inline>
+        </w:drawing>
+      </w:r>
+    </w:p>
+    <w:p>
+      <w:pPr>
+        <w:jc w:val="center"/>
+      </w:pPr>
+      <w:r>
+        <w:rPr>
+          <w:i/>
+          <w:color w:val="646464"/>
+          <w:sz w:val="18"/>
+        </w:rPr>
+        <w:t>Figura: 3.1 Dashboard</w:t>
+      </w:r>
+    </w:p>
+    <w:p/>
     <w:p/>
     <w:p>
       <w:r/>
@@ -1994,6 +2044,56 @@
         <w:t>3.2 Leads</w:t>
       </w:r>
     </w:p>
+    <w:p>
+      <w:r>
+        <w:drawing>
+          <wp:inline xmlns:a="http://schemas.openxmlformats.org/drawingml/2006/main" xmlns:pic="http://schemas.openxmlformats.org/drawingml/2006/picture">
+            <wp:extent cx="5486400" cy="3086100"/>
+            <wp:docPr id="3" name="Picture 3"/>
+            <wp:cNvGraphicFramePr>
+              <a:graphicFrameLocks noChangeAspect="1"/>
+            </wp:cNvGraphicFramePr>
+            <a:graphic>
+              <a:graphicData uri="http://schemas.openxmlformats.org/drawingml/2006/picture">
+                <pic:pic>
+                  <pic:nvPicPr>
+                    <pic:cNvPr id="0" name="02-leads.png"/>
+                    <pic:cNvPicPr/>
+                  </pic:nvPicPr>
+                  <pic:blipFill>
+                    <a:blip r:embed="rId11"/>
+                    <a:stretch>
+                      <a:fillRect/>
+                    </a:stretch>
+                  </pic:blipFill>
+                  <pic:spPr>
+                    <a:xfrm>
+                      <a:off x="0" y="0"/>
+                      <a:ext cx="5486400" cy="3086100"/>
+                    </a:xfrm>
+                    <a:prstGeom prst="rect"/>
+                  </pic:spPr>
+                </pic:pic>
+              </a:graphicData>
+            </a:graphic>
+          </wp:inline>
+        </w:drawing>
+      </w:r>
+    </w:p>
+    <w:p>
+      <w:pPr>
+        <w:jc w:val="center"/>
+      </w:pPr>
+      <w:r>
+        <w:rPr>
+          <w:i/>
+          <w:color w:val="646464"/>
+          <w:sz w:val="18"/>
+        </w:rPr>
+        <w:t>Figura: 3.2 Leads</w:t>
+      </w:r>
+    </w:p>
+    <w:p/>
     <w:p/>
     <w:p>
       <w:r/>
@@ -2386,6 +2486,56 @@
         <w:t>3.3 Properties</w:t>
       </w:r>
     </w:p>
+    <w:p>
+      <w:r>
+        <w:drawing>
+          <wp:inline xmlns:a="http://schemas.openxmlformats.org/drawingml/2006/main" xmlns:pic="http://schemas.openxmlformats.org/drawingml/2006/picture">
+            <wp:extent cx="5486400" cy="3086100"/>
+            <wp:docPr id="4" name="Picture 4"/>
+            <wp:cNvGraphicFramePr>
+              <a:graphicFrameLocks noChangeAspect="1"/>
+            </wp:cNvGraphicFramePr>
+            <a:graphic>
+              <a:graphicData uri="http://schemas.openxmlformats.org/drawingml/2006/picture">
+                <pic:pic>
+                  <pic:nvPicPr>
+                    <pic:cNvPr id="0" name="03-properties.png"/>
+                    <pic:cNvPicPr/>
+                  </pic:nvPicPr>
+                  <pic:blipFill>
+                    <a:blip r:embed="rId12"/>
+                    <a:stretch>
+                      <a:fillRect/>
+                    </a:stretch>
+                  </pic:blipFill>
+                  <pic:spPr>
+                    <a:xfrm>
+                      <a:off x="0" y="0"/>
+                      <a:ext cx="5486400" cy="3086100"/>
+                    </a:xfrm>
+                    <a:prstGeom prst="rect"/>
+                  </pic:spPr>
+                </pic:pic>
+              </a:graphicData>
+            </a:graphic>
+          </wp:inline>
+        </w:drawing>
+      </w:r>
+    </w:p>
+    <w:p>
+      <w:pPr>
+        <w:jc w:val="center"/>
+      </w:pPr>
+      <w:r>
+        <w:rPr>
+          <w:i/>
+          <w:color w:val="646464"/>
+          <w:sz w:val="18"/>
+        </w:rPr>
+        <w:t>Figura: 3.3 Properties</w:t>
+      </w:r>
+    </w:p>
+    <w:p/>
     <w:p/>
     <w:p>
       <w:r/>
@@ -2835,6 +2985,56 @@
         <w:t>3.4 Tasks</w:t>
       </w:r>
     </w:p>
+    <w:p>
+      <w:r>
+        <w:drawing>
+          <wp:inline xmlns:a="http://schemas.openxmlformats.org/drawingml/2006/main" xmlns:pic="http://schemas.openxmlformats.org/drawingml/2006/picture">
+            <wp:extent cx="5486400" cy="3086100"/>
+            <wp:docPr id="5" name="Picture 5"/>
+            <wp:cNvGraphicFramePr>
+              <a:graphicFrameLocks noChangeAspect="1"/>
+            </wp:cNvGraphicFramePr>
+            <a:graphic>
+              <a:graphicData uri="http://schemas.openxmlformats.org/drawingml/2006/picture">
+                <pic:pic>
+                  <pic:nvPicPr>
+                    <pic:cNvPr id="0" name="04-tasks.png"/>
+                    <pic:cNvPicPr/>
+                  </pic:nvPicPr>
+                  <pic:blipFill>
+                    <a:blip r:embed="rId13"/>
+                    <a:stretch>
+                      <a:fillRect/>
+                    </a:stretch>
+                  </pic:blipFill>
+                  <pic:spPr>
+                    <a:xfrm>
+                      <a:off x="0" y="0"/>
+                      <a:ext cx="5486400" cy="3086100"/>
+                    </a:xfrm>
+                    <a:prstGeom prst="rect"/>
+                  </pic:spPr>
+                </pic:pic>
+              </a:graphicData>
+            </a:graphic>
+          </wp:inline>
+        </w:drawing>
+      </w:r>
+    </w:p>
+    <w:p>
+      <w:pPr>
+        <w:jc w:val="center"/>
+      </w:pPr>
+      <w:r>
+        <w:rPr>
+          <w:i/>
+          <w:color w:val="646464"/>
+          <w:sz w:val="18"/>
+        </w:rPr>
+        <w:t>Figura: 3.4 Tasks</w:t>
+      </w:r>
+    </w:p>
+    <w:p/>
     <w:p/>
     <w:p>
       <w:r/>
@@ -3254,6 +3454,56 @@
         <w:t>3.5 Team</w:t>
       </w:r>
     </w:p>
+    <w:p>
+      <w:r>
+        <w:drawing>
+          <wp:inline xmlns:a="http://schemas.openxmlformats.org/drawingml/2006/main" xmlns:pic="http://schemas.openxmlformats.org/drawingml/2006/picture">
+            <wp:extent cx="5486400" cy="3086100"/>
+            <wp:docPr id="6" name="Picture 6"/>
+            <wp:cNvGraphicFramePr>
+              <a:graphicFrameLocks noChangeAspect="1"/>
+            </wp:cNvGraphicFramePr>
+            <a:graphic>
+              <a:graphicData uri="http://schemas.openxmlformats.org/drawingml/2006/picture">
+                <pic:pic>
+                  <pic:nvPicPr>
+                    <pic:cNvPr id="0" name="05-team.png"/>
+                    <pic:cNvPicPr/>
+                  </pic:nvPicPr>
+                  <pic:blipFill>
+                    <a:blip r:embed="rId14"/>
+                    <a:stretch>
+                      <a:fillRect/>
+                    </a:stretch>
+                  </pic:blipFill>
+                  <pic:spPr>
+                    <a:xfrm>
+                      <a:off x="0" y="0"/>
+                      <a:ext cx="5486400" cy="3086100"/>
+                    </a:xfrm>
+                    <a:prstGeom prst="rect"/>
+                  </pic:spPr>
+                </pic:pic>
+              </a:graphicData>
+            </a:graphic>
+          </wp:inline>
+        </w:drawing>
+      </w:r>
+    </w:p>
+    <w:p>
+      <w:pPr>
+        <w:jc w:val="center"/>
+      </w:pPr>
+      <w:r>
+        <w:rPr>
+          <w:i/>
+          <w:color w:val="646464"/>
+          <w:sz w:val="18"/>
+        </w:rPr>
+        <w:t>Figura: 3.5 Team</w:t>
+      </w:r>
+    </w:p>
+    <w:p/>
     <w:p/>
     <w:p>
       <w:r/>
@@ -3706,6 +3956,56 @@
         <w:t>4.2 Prospection operativa</w:t>
       </w:r>
     </w:p>
+    <w:p>
+      <w:r>
+        <w:drawing>
+          <wp:inline xmlns:a="http://schemas.openxmlformats.org/drawingml/2006/main" xmlns:pic="http://schemas.openxmlformats.org/drawingml/2006/picture">
+            <wp:extent cx="5486400" cy="3086100"/>
+            <wp:docPr id="7" name="Picture 7"/>
+            <wp:cNvGraphicFramePr>
+              <a:graphicFrameLocks noChangeAspect="1"/>
+            </wp:cNvGraphicFramePr>
+            <a:graphic>
+              <a:graphicData uri="http://schemas.openxmlformats.org/drawingml/2006/picture">
+                <pic:pic>
+                  <pic:nvPicPr>
+                    <pic:cNvPr id="0" name="06-prospection-unified.png"/>
+                    <pic:cNvPicPr/>
+                  </pic:nvPicPr>
+                  <pic:blipFill>
+                    <a:blip r:embed="rId15"/>
+                    <a:stretch>
+                      <a:fillRect/>
+                    </a:stretch>
+                  </pic:blipFill>
+                  <pic:spPr>
+                    <a:xfrm>
+                      <a:off x="0" y="0"/>
+                      <a:ext cx="5486400" cy="3086100"/>
+                    </a:xfrm>
+                    <a:prstGeom prst="rect"/>
+                  </pic:spPr>
+                </pic:pic>
+              </a:graphicData>
+            </a:graphic>
+          </wp:inline>
+        </w:drawing>
+      </w:r>
+    </w:p>
+    <w:p>
+      <w:pPr>
+        <w:jc w:val="center"/>
+      </w:pPr>
+      <w:r>
+        <w:rPr>
+          <w:i/>
+          <w:color w:val="646464"/>
+          <w:sz w:val="18"/>
+        </w:rPr>
+        <w:t>Figura: 4.2 Prospection operativa</w:t>
+      </w:r>
+    </w:p>
+    <w:p/>
     <w:p/>
     <w:p>
       <w:r/>
@@ -4256,6 +4556,56 @@
         <w:t>4.3 Seller Pipeline</w:t>
       </w:r>
     </w:p>
+    <w:p>
+      <w:r>
+        <w:drawing>
+          <wp:inline xmlns:a="http://schemas.openxmlformats.org/drawingml/2006/main" xmlns:pic="http://schemas.openxmlformats.org/drawingml/2006/picture">
+            <wp:extent cx="5486400" cy="3086100"/>
+            <wp:docPr id="8" name="Picture 8"/>
+            <wp:cNvGraphicFramePr>
+              <a:graphicFrameLocks noChangeAspect="1"/>
+            </wp:cNvGraphicFramePr>
+            <a:graphic>
+              <a:graphicData uri="http://schemas.openxmlformats.org/drawingml/2006/picture">
+                <pic:pic>
+                  <pic:nvPicPr>
+                    <pic:cNvPr id="0" name="07-sellers.png"/>
+                    <pic:cNvPicPr/>
+                  </pic:nvPicPr>
+                  <pic:blipFill>
+                    <a:blip r:embed="rId16"/>
+                    <a:stretch>
+                      <a:fillRect/>
+                    </a:stretch>
+                  </pic:blipFill>
+                  <pic:spPr>
+                    <a:xfrm>
+                      <a:off x="0" y="0"/>
+                      <a:ext cx="5486400" cy="3086100"/>
+                    </a:xfrm>
+                    <a:prstGeom prst="rect"/>
+                  </pic:spPr>
+                </pic:pic>
+              </a:graphicData>
+            </a:graphic>
+          </wp:inline>
+        </w:drawing>
+      </w:r>
+    </w:p>
+    <w:p>
+      <w:pPr>
+        <w:jc w:val="center"/>
+      </w:pPr>
+      <w:r>
+        <w:rPr>
+          <w:i/>
+          <w:color w:val="646464"/>
+          <w:sz w:val="18"/>
+        </w:rPr>
+        <w:t>Figura: 4.3 Seller Pipeline</w:t>
+      </w:r>
+    </w:p>
+    <w:p/>
     <w:p/>
     <w:p>
       <w:r/>
@@ -4986,6 +5336,56 @@
         <w:t>4.4 Opportunity Ranking</w:t>
       </w:r>
     </w:p>
+    <w:p>
+      <w:r>
+        <w:drawing>
+          <wp:inline xmlns:a="http://schemas.openxmlformats.org/drawingml/2006/main" xmlns:pic="http://schemas.openxmlformats.org/drawingml/2006/picture">
+            <wp:extent cx="5486400" cy="3086100"/>
+            <wp:docPr id="9" name="Picture 9"/>
+            <wp:cNvGraphicFramePr>
+              <a:graphicFrameLocks noChangeAspect="1"/>
+            </wp:cNvGraphicFramePr>
+            <a:graphic>
+              <a:graphicData uri="http://schemas.openxmlformats.org/drawingml/2006/picture">
+                <pic:pic>
+                  <pic:nvPicPr>
+                    <pic:cNvPr id="0" name="08-opportunity-ranking.png"/>
+                    <pic:cNvPicPr/>
+                  </pic:nvPicPr>
+                  <pic:blipFill>
+                    <a:blip r:embed="rId17"/>
+                    <a:stretch>
+                      <a:fillRect/>
+                    </a:stretch>
+                  </pic:blipFill>
+                  <pic:spPr>
+                    <a:xfrm>
+                      <a:off x="0" y="0"/>
+                      <a:ext cx="5486400" cy="3086100"/>
+                    </a:xfrm>
+                    <a:prstGeom prst="rect"/>
+                  </pic:spPr>
+                </pic:pic>
+              </a:graphicData>
+            </a:graphic>
+          </wp:inline>
+        </w:drawing>
+      </w:r>
+    </w:p>
+    <w:p>
+      <w:pPr>
+        <w:jc w:val="center"/>
+      </w:pPr>
+      <w:r>
+        <w:rPr>
+          <w:i/>
+          <w:color w:val="646464"/>
+          <w:sz w:val="18"/>
+        </w:rPr>
+        <w:t>Figura: 4.4 Opportunity Ranking</w:t>
+      </w:r>
+    </w:p>
+    <w:p/>
     <w:p/>
     <w:p>
       <w:r/>
@@ -5229,6 +5629,56 @@
         <w:t>4.5 Intelligence</w:t>
       </w:r>
     </w:p>
+    <w:p>
+      <w:r>
+        <w:drawing>
+          <wp:inline xmlns:a="http://schemas.openxmlformats.org/drawingml/2006/main" xmlns:pic="http://schemas.openxmlformats.org/drawingml/2006/picture">
+            <wp:extent cx="5486400" cy="3086100"/>
+            <wp:docPr id="10" name="Picture 10"/>
+            <wp:cNvGraphicFramePr>
+              <a:graphicFrameLocks noChangeAspect="1"/>
+            </wp:cNvGraphicFramePr>
+            <a:graphic>
+              <a:graphicData uri="http://schemas.openxmlformats.org/drawingml/2006/picture">
+                <pic:pic>
+                  <pic:nvPicPr>
+                    <pic:cNvPr id="0" name="09-intelligence.png"/>
+                    <pic:cNvPicPr/>
+                  </pic:nvPicPr>
+                  <pic:blipFill>
+                    <a:blip r:embed="rId18"/>
+                    <a:stretch>
+                      <a:fillRect/>
+                    </a:stretch>
+                  </pic:blipFill>
+                  <pic:spPr>
+                    <a:xfrm>
+                      <a:off x="0" y="0"/>
+                      <a:ext cx="5486400" cy="3086100"/>
+                    </a:xfrm>
+                    <a:prstGeom prst="rect"/>
+                  </pic:spPr>
+                </pic:pic>
+              </a:graphicData>
+            </a:graphic>
+          </wp:inline>
+        </w:drawing>
+      </w:r>
+    </w:p>
+    <w:p>
+      <w:pPr>
+        <w:jc w:val="center"/>
+      </w:pPr>
+      <w:r>
+        <w:rPr>
+          <w:i/>
+          <w:color w:val="646464"/>
+          <w:sz w:val="18"/>
+        </w:rPr>
+        <w:t>Figura: 4.5 Intelligence</w:t>
+      </w:r>
+    </w:p>
+    <w:p/>
     <w:p/>
     <w:p>
       <w:r/>
@@ -5825,6 +6275,56 @@
         <w:t>5.1 Ingestion</w:t>
       </w:r>
     </w:p>
+    <w:p>
+      <w:r>
+        <w:drawing>
+          <wp:inline xmlns:a="http://schemas.openxmlformats.org/drawingml/2006/main" xmlns:pic="http://schemas.openxmlformats.org/drawingml/2006/picture">
+            <wp:extent cx="5486400" cy="3086100"/>
+            <wp:docPr id="11" name="Picture 11"/>
+            <wp:cNvGraphicFramePr>
+              <a:graphicFrameLocks noChangeAspect="1"/>
+            </wp:cNvGraphicFramePr>
+            <a:graphic>
+              <a:graphicData uri="http://schemas.openxmlformats.org/drawingml/2006/picture">
+                <pic:pic>
+                  <pic:nvPicPr>
+                    <pic:cNvPr id="0" name="11-ingestion.png"/>
+                    <pic:cNvPicPr/>
+                  </pic:nvPicPr>
+                  <pic:blipFill>
+                    <a:blip r:embed="rId19"/>
+                    <a:stretch>
+                      <a:fillRect/>
+                    </a:stretch>
+                  </pic:blipFill>
+                  <pic:spPr>
+                    <a:xfrm>
+                      <a:off x="0" y="0"/>
+                      <a:ext cx="5486400" cy="3086100"/>
+                    </a:xfrm>
+                    <a:prstGeom prst="rect"/>
+                  </pic:spPr>
+                </pic:pic>
+              </a:graphicData>
+            </a:graphic>
+          </wp:inline>
+        </w:drawing>
+      </w:r>
+    </w:p>
+    <w:p>
+      <w:pPr>
+        <w:jc w:val="center"/>
+      </w:pPr>
+      <w:r>
+        <w:rPr>
+          <w:i/>
+          <w:color w:val="646464"/>
+          <w:sz w:val="18"/>
+        </w:rPr>
+        <w:t>Figura: 5.1 Ingestion</w:t>
+      </w:r>
+    </w:p>
+    <w:p/>
     <w:p/>
     <w:p>
       <w:r/>
@@ -5998,6 +6498,56 @@
         <w:t>5.2 Data Quality</w:t>
       </w:r>
     </w:p>
+    <w:p>
+      <w:r>
+        <w:drawing>
+          <wp:inline xmlns:a="http://schemas.openxmlformats.org/drawingml/2006/main" xmlns:pic="http://schemas.openxmlformats.org/drawingml/2006/picture">
+            <wp:extent cx="5486400" cy="3086100"/>
+            <wp:docPr id="12" name="Picture 12"/>
+            <wp:cNvGraphicFramePr>
+              <a:graphicFrameLocks noChangeAspect="1"/>
+            </wp:cNvGraphicFramePr>
+            <a:graphic>
+              <a:graphicData uri="http://schemas.openxmlformats.org/drawingml/2006/picture">
+                <pic:pic>
+                  <pic:nvPicPr>
+                    <pic:cNvPr id="0" name="12-data-quality.png"/>
+                    <pic:cNvPicPr/>
+                  </pic:nvPicPr>
+                  <pic:blipFill>
+                    <a:blip r:embed="rId20"/>
+                    <a:stretch>
+                      <a:fillRect/>
+                    </a:stretch>
+                  </pic:blipFill>
+                  <pic:spPr>
+                    <a:xfrm>
+                      <a:off x="0" y="0"/>
+                      <a:ext cx="5486400" cy="3086100"/>
+                    </a:xfrm>
+                    <a:prstGeom prst="rect"/>
+                  </pic:spPr>
+                </pic:pic>
+              </a:graphicData>
+            </a:graphic>
+          </wp:inline>
+        </w:drawing>
+      </w:r>
+    </w:p>
+    <w:p>
+      <w:pPr>
+        <w:jc w:val="center"/>
+      </w:pPr>
+      <w:r>
+        <w:rPr>
+          <w:i/>
+          <w:color w:val="646464"/>
+          <w:sz w:val="18"/>
+        </w:rPr>
+        <w:t>Figura: 5.2 Data Quality</w:t>
+      </w:r>
+    </w:p>
+    <w:p/>
     <w:p/>
     <w:p>
       <w:r/>
@@ -6243,6 +6793,56 @@
         <w:t>5.3 Feed Orchestrator</w:t>
       </w:r>
     </w:p>
+    <w:p>
+      <w:r>
+        <w:drawing>
+          <wp:inline xmlns:a="http://schemas.openxmlformats.org/drawingml/2006/main" xmlns:pic="http://schemas.openxmlformats.org/drawingml/2006/picture">
+            <wp:extent cx="5486400" cy="3086100"/>
+            <wp:docPr id="13" name="Picture 13"/>
+            <wp:cNvGraphicFramePr>
+              <a:graphicFrameLocks noChangeAspect="1"/>
+            </wp:cNvGraphicFramePr>
+            <a:graphic>
+              <a:graphicData uri="http://schemas.openxmlformats.org/drawingml/2006/picture">
+                <pic:pic>
+                  <pic:nvPicPr>
+                    <pic:cNvPr id="0" name="13-feed-orchestrator.png"/>
+                    <pic:cNvPicPr/>
+                  </pic:nvPicPr>
+                  <pic:blipFill>
+                    <a:blip r:embed="rId21"/>
+                    <a:stretch>
+                      <a:fillRect/>
+                    </a:stretch>
+                  </pic:blipFill>
+                  <pic:spPr>
+                    <a:xfrm>
+                      <a:off x="0" y="0"/>
+                      <a:ext cx="5486400" cy="3086100"/>
+                    </a:xfrm>
+                    <a:prstGeom prst="rect"/>
+                  </pic:spPr>
+                </pic:pic>
+              </a:graphicData>
+            </a:graphic>
+          </wp:inline>
+        </w:drawing>
+      </w:r>
+    </w:p>
+    <w:p>
+      <w:pPr>
+        <w:jc w:val="center"/>
+      </w:pPr>
+      <w:r>
+        <w:rPr>
+          <w:i/>
+          <w:color w:val="646464"/>
+          <w:sz w:val="18"/>
+        </w:rPr>
+        <w:t>Figura: 5.3 Feed Orchestrator</w:t>
+      </w:r>
+    </w:p>
+    <w:p/>
     <w:p/>
     <w:p>
       <w:r/>
@@ -6525,6 +7125,56 @@
         <w:t>5.4 Automation &amp; Alerting</w:t>
       </w:r>
     </w:p>
+    <w:p>
+      <w:r>
+        <w:drawing>
+          <wp:inline xmlns:a="http://schemas.openxmlformats.org/drawingml/2006/main" xmlns:pic="http://schemas.openxmlformats.org/drawingml/2006/picture">
+            <wp:extent cx="5486400" cy="3086100"/>
+            <wp:docPr id="14" name="Picture 14"/>
+            <wp:cNvGraphicFramePr>
+              <a:graphicFrameLocks noChangeAspect="1"/>
+            </wp:cNvGraphicFramePr>
+            <a:graphic>
+              <a:graphicData uri="http://schemas.openxmlformats.org/drawingml/2006/picture">
+                <pic:pic>
+                  <pic:nvPicPr>
+                    <pic:cNvPr id="0" name="14-automation-alerting.png"/>
+                    <pic:cNvPicPr/>
+                  </pic:nvPicPr>
+                  <pic:blipFill>
+                    <a:blip r:embed="rId22"/>
+                    <a:stretch>
+                      <a:fillRect/>
+                    </a:stretch>
+                  </pic:blipFill>
+                  <pic:spPr>
+                    <a:xfrm>
+                      <a:off x="0" y="0"/>
+                      <a:ext cx="5486400" cy="3086100"/>
+                    </a:xfrm>
+                    <a:prstGeom prst="rect"/>
+                  </pic:spPr>
+                </pic:pic>
+              </a:graphicData>
+            </a:graphic>
+          </wp:inline>
+        </w:drawing>
+      </w:r>
+    </w:p>
+    <w:p>
+      <w:pPr>
+        <w:jc w:val="center"/>
+      </w:pPr>
+      <w:r>
+        <w:rPr>
+          <w:i/>
+          <w:color w:val="646464"/>
+          <w:sz w:val="18"/>
+        </w:rPr>
+        <w:t>Figura: 5.4 Automation &amp; Alerting</w:t>
+      </w:r>
+    </w:p>
+    <w:p/>
     <w:p/>
     <w:p>
       <w:r/>
@@ -6824,6 +7474,56 @@
         <w:t>5.5 Command Center</w:t>
       </w:r>
     </w:p>
+    <w:p>
+      <w:r>
+        <w:drawing>
+          <wp:inline xmlns:a="http://schemas.openxmlformats.org/drawingml/2006/main" xmlns:pic="http://schemas.openxmlformats.org/drawingml/2006/picture">
+            <wp:extent cx="5486400" cy="3086100"/>
+            <wp:docPr id="15" name="Picture 15"/>
+            <wp:cNvGraphicFramePr>
+              <a:graphicFrameLocks noChangeAspect="1"/>
+            </wp:cNvGraphicFramePr>
+            <a:graphic>
+              <a:graphicData uri="http://schemas.openxmlformats.org/drawingml/2006/picture">
+                <pic:pic>
+                  <pic:nvPicPr>
+                    <pic:cNvPr id="0" name="15-command-center.png"/>
+                    <pic:cNvPicPr/>
+                  </pic:nvPicPr>
+                  <pic:blipFill>
+                    <a:blip r:embed="rId23"/>
+                    <a:stretch>
+                      <a:fillRect/>
+                    </a:stretch>
+                  </pic:blipFill>
+                  <pic:spPr>
+                    <a:xfrm>
+                      <a:off x="0" y="0"/>
+                      <a:ext cx="5486400" cy="3086100"/>
+                    </a:xfrm>
+                    <a:prstGeom prst="rect"/>
+                  </pic:spPr>
+                </pic:pic>
+              </a:graphicData>
+            </a:graphic>
+          </wp:inline>
+        </w:drawing>
+      </w:r>
+    </w:p>
+    <w:p>
+      <w:pPr>
+        <w:jc w:val="center"/>
+      </w:pPr>
+      <w:r>
+        <w:rPr>
+          <w:i/>
+          <w:color w:val="646464"/>
+          <w:sz w:val="18"/>
+        </w:rPr>
+        <w:t>Figura: 5.5 Command Center</w:t>
+      </w:r>
+    </w:p>
+    <w:p/>
     <w:p/>
     <w:p>
       <w:r/>
@@ -7114,6 +7814,56 @@
         <w:t>5.6 Deal Margin Simulator</w:t>
       </w:r>
     </w:p>
+    <w:p>
+      <w:r>
+        <w:drawing>
+          <wp:inline xmlns:a="http://schemas.openxmlformats.org/drawingml/2006/main" xmlns:pic="http://schemas.openxmlformats.org/drawingml/2006/picture">
+            <wp:extent cx="5486400" cy="3086100"/>
+            <wp:docPr id="16" name="Picture 16"/>
+            <wp:cNvGraphicFramePr>
+              <a:graphicFrameLocks noChangeAspect="1"/>
+            </wp:cNvGraphicFramePr>
+            <a:graphic>
+              <a:graphicData uri="http://schemas.openxmlformats.org/drawingml/2006/picture">
+                <pic:pic>
+                  <pic:nvPicPr>
+                    <pic:cNvPr id="0" name="16-deal-margin-simulator.png"/>
+                    <pic:cNvPicPr/>
+                  </pic:nvPicPr>
+                  <pic:blipFill>
+                    <a:blip r:embed="rId24"/>
+                    <a:stretch>
+                      <a:fillRect/>
+                    </a:stretch>
+                  </pic:blipFill>
+                  <pic:spPr>
+                    <a:xfrm>
+                      <a:off x="0" y="0"/>
+                      <a:ext cx="5486400" cy="3086100"/>
+                    </a:xfrm>
+                    <a:prstGeom prst="rect"/>
+                  </pic:spPr>
+                </pic:pic>
+              </a:graphicData>
+            </a:graphic>
+          </wp:inline>
+        </w:drawing>
+      </w:r>
+    </w:p>
+    <w:p>
+      <w:pPr>
+        <w:jc w:val="center"/>
+      </w:pPr>
+      <w:r>
+        <w:rPr>
+          <w:i/>
+          <w:color w:val="646464"/>
+          <w:sz w:val="18"/>
+        </w:rPr>
+        <w:t>Figura: 5.6 Deal Margin Simulator</w:t>
+      </w:r>
+    </w:p>
+    <w:p/>
     <w:p/>
     <w:p>
       <w:r/>
@@ -7455,6 +8205,56 @@
         <w:t>5.7 Source Observatory</w:t>
       </w:r>
     </w:p>
+    <w:p>
+      <w:r>
+        <w:drawing>
+          <wp:inline xmlns:a="http://schemas.openxmlformats.org/drawingml/2006/main" xmlns:pic="http://schemas.openxmlformats.org/drawingml/2006/picture">
+            <wp:extent cx="5486400" cy="3086100"/>
+            <wp:docPr id="17" name="Picture 17"/>
+            <wp:cNvGraphicFramePr>
+              <a:graphicFrameLocks noChangeAspect="1"/>
+            </wp:cNvGraphicFramePr>
+            <a:graphic>
+              <a:graphicData uri="http://schemas.openxmlformats.org/drawingml/2006/picture">
+                <pic:pic>
+                  <pic:nvPicPr>
+                    <pic:cNvPr id="0" name="17-source-observatory.png"/>
+                    <pic:cNvPicPr/>
+                  </pic:nvPicPr>
+                  <pic:blipFill>
+                    <a:blip r:embed="rId25"/>
+                    <a:stretch>
+                      <a:fillRect/>
+                    </a:stretch>
+                  </pic:blipFill>
+                  <pic:spPr>
+                    <a:xfrm>
+                      <a:off x="0" y="0"/>
+                      <a:ext cx="5486400" cy="3086100"/>
+                    </a:xfrm>
+                    <a:prstGeom prst="rect"/>
+                  </pic:spPr>
+                </pic:pic>
+              </a:graphicData>
+            </a:graphic>
+          </wp:inline>
+        </w:drawing>
+      </w:r>
+    </w:p>
+    <w:p>
+      <w:pPr>
+        <w:jc w:val="center"/>
+      </w:pPr>
+      <w:r>
+        <w:rPr>
+          <w:i/>
+          <w:color w:val="646464"/>
+          <w:sz w:val="18"/>
+        </w:rPr>
+        <w:t>Figura: 5.7 Source Observatory</w:t>
+      </w:r>
+    </w:p>
+    <w:p/>
     <w:p/>
     <w:p>
       <w:r/>
@@ -11455,7 +12255,7 @@
     </w:p>
     <w:p/>
     <w:sectPr>
-      <w:footerReference w:type="default" r:id="rId10"/>
+      <w:footerReference w:type="default" r:id="rId26"/>
       <w:pgSz w:w="12240" w:h="15840"/>
       <w:pgMar w:top="1440" w:right="1800" w:bottom="1440" w:left="1800" w:header="720" w:footer="720" w:gutter="0"/>
       <w:cols w:space="720"/>

</xml_diff>